<commit_message>
Add study guides for lessons 2-2 to 2-4
Co-Authored-By: Claude Opus 5.5 <noreply@anthropic.com>
</commit_message>
<xml_diff>
--- a/docs/study-guides/chapter-2/word/Lesson-2-01-Represent-4-Digit-Numbers.docx
+++ b/docs/study-guides/chapter-2/word/Lesson-2-01-Represent-4-Digit-Numbers.docx
@@ -1924,10 +1924,10 @@
         <w:tblLayout w:type="fixed"/>
       </w:tblPr>
       <w:tblGrid>
-        <w:gridCol w:w="560"/>
-        <w:gridCol w:w="4552"/>
-        <w:gridCol w:w="560"/>
-        <w:gridCol w:w="4552"/>
+        <w:gridCol w:w="660"/>
+        <w:gridCol w:w="4452"/>
+        <w:gridCol w:w="660"/>
+        <w:gridCol w:w="4452"/>
       </w:tblGrid>
       <w:tr>
         <w:trPr>
@@ -1935,7 +1935,7 @@
         </w:trPr>
         <w:tc>
           <w:tcPr>
-            <w:tcW w:type="dxa" w:w="560"/>
+            <w:tcW w:type="dxa" w:w="660"/>
             <w:tcBorders>
               <w:top w:val="none" w:color="FFFFFF" w:sz="0"/>
               <w:left w:val="none" w:color="FFFFFF" w:sz="0"/>
@@ -1962,7 +1962,7 @@
         </w:tc>
         <w:tc>
           <w:tcPr>
-            <w:tcW w:type="dxa" w:w="9664"/>
+            <w:tcW w:type="dxa" w:w="9564"/>
             <w:gridSpan w:val="3"/>
             <w:tcBorders>
               <w:top w:val="none" w:color="FFFFFF" w:sz="0"/>
@@ -2219,7 +2219,7 @@
             <w:pPr>
               <w:keepLines/>
               <w:tabs>
-                <w:tab w:val="right" w:pos="9404" w:leader="underscore"/>
+                <w:tab w:val="right" w:pos="9304" w:leader="underscore"/>
               </w:tabs>
               <w:spacing w:after="40" w:before="220"/>
             </w:pPr>
@@ -2248,7 +2248,7 @@
         </w:trPr>
         <w:tc>
           <w:tcPr>
-            <w:tcW w:type="dxa" w:w="560"/>
+            <w:tcW w:type="dxa" w:w="660"/>
             <w:tcBorders>
               <w:top w:val="none" w:color="FFFFFF" w:sz="0"/>
               <w:left w:val="none" w:color="FFFFFF" w:sz="0"/>
@@ -2275,7 +2275,7 @@
         </w:tc>
         <w:tc>
           <w:tcPr>
-            <w:tcW w:type="dxa" w:w="9664"/>
+            <w:tcW w:type="dxa" w:w="9564"/>
             <w:gridSpan w:val="3"/>
             <w:tcBorders>
               <w:top w:val="none" w:color="FFFFFF" w:sz="0"/>
@@ -2323,7 +2323,7 @@
             <w:pPr>
               <w:keepLines/>
               <w:tabs>
-                <w:tab w:val="right" w:pos="9404" w:leader="underscore"/>
+                <w:tab w:val="right" w:pos="9304" w:leader="underscore"/>
               </w:tabs>
               <w:spacing w:after="40" w:before="220"/>
             </w:pPr>
@@ -2348,7 +2348,7 @@
             <w:pPr>
               <w:keepLines/>
               <w:tabs>
-                <w:tab w:val="right" w:pos="9404" w:leader="underscore"/>
+                <w:tab w:val="right" w:pos="9304" w:leader="underscore"/>
               </w:tabs>
               <w:spacing w:after="40" w:before="220"/>
             </w:pPr>
@@ -2373,7 +2373,7 @@
             <w:pPr>
               <w:keepLines/>
               <w:tabs>
-                <w:tab w:val="right" w:pos="9404" w:leader="underscore"/>
+                <w:tab w:val="right" w:pos="9304" w:leader="underscore"/>
               </w:tabs>
               <w:spacing w:after="40" w:before="220"/>
             </w:pPr>
@@ -2394,7 +2394,7 @@
         </w:trPr>
         <w:tc>
           <w:tcPr>
-            <w:tcW w:type="dxa" w:w="560"/>
+            <w:tcW w:type="dxa" w:w="660"/>
             <w:tcBorders>
               <w:top w:val="none" w:color="FFFFFF" w:sz="0"/>
               <w:left w:val="none" w:color="FFFFFF" w:sz="0"/>
@@ -2421,7 +2421,7 @@
         </w:tc>
         <w:tc>
           <w:tcPr>
-            <w:tcW w:type="dxa" w:w="9664"/>
+            <w:tcW w:type="dxa" w:w="9564"/>
             <w:gridSpan w:val="3"/>
             <w:tcBorders>
               <w:top w:val="none" w:color="FFFFFF" w:sz="0"/>
@@ -2469,7 +2469,7 @@
             <w:pPr>
               <w:keepLines/>
               <w:tabs>
-                <w:tab w:val="right" w:pos="9404" w:leader="underscore"/>
+                <w:tab w:val="right" w:pos="9304" w:leader="underscore"/>
               </w:tabs>
               <w:spacing w:after="40" w:before="220"/>
             </w:pPr>
@@ -2494,7 +2494,7 @@
             <w:pPr>
               <w:keepLines/>
               <w:tabs>
-                <w:tab w:val="right" w:pos="9404" w:leader="underscore"/>
+                <w:tab w:val="right" w:pos="9304" w:leader="underscore"/>
               </w:tabs>
               <w:spacing w:after="40" w:before="220"/>
             </w:pPr>
@@ -2561,10 +2561,10 @@
         <w:tblLayout w:type="fixed"/>
       </w:tblPr>
       <w:tblGrid>
-        <w:gridCol w:w="560"/>
-        <w:gridCol w:w="4552"/>
-        <w:gridCol w:w="560"/>
-        <w:gridCol w:w="4552"/>
+        <w:gridCol w:w="660"/>
+        <w:gridCol w:w="4452"/>
+        <w:gridCol w:w="660"/>
+        <w:gridCol w:w="4452"/>
       </w:tblGrid>
       <w:tr>
         <w:trPr>
@@ -2572,7 +2572,7 @@
         </w:trPr>
         <w:tc>
           <w:tcPr>
-            <w:tcW w:type="dxa" w:w="560"/>
+            <w:tcW w:type="dxa" w:w="660"/>
             <w:tcBorders>
               <w:top w:val="none" w:color="FFFFFF" w:sz="0"/>
               <w:left w:val="none" w:color="FFFFFF" w:sz="0"/>
@@ -2599,7 +2599,7 @@
         </w:tc>
         <w:tc>
           <w:tcPr>
-            <w:tcW w:type="dxa" w:w="9664"/>
+            <w:tcW w:type="dxa" w:w="9564"/>
             <w:gridSpan w:val="3"/>
             <w:tcBorders>
               <w:top w:val="none" w:color="FFFFFF" w:sz="0"/>
@@ -2856,7 +2856,7 @@
             <w:pPr>
               <w:keepLines/>
               <w:tabs>
-                <w:tab w:val="right" w:pos="9404" w:leader="underscore"/>
+                <w:tab w:val="right" w:pos="9304" w:leader="underscore"/>
               </w:tabs>
               <w:spacing w:after="40" w:before="220"/>
             </w:pPr>
@@ -2885,7 +2885,7 @@
         </w:trPr>
         <w:tc>
           <w:tcPr>
-            <w:tcW w:type="dxa" w:w="560"/>
+            <w:tcW w:type="dxa" w:w="660"/>
             <w:tcBorders>
               <w:top w:val="none" w:color="FFFFFF" w:sz="0"/>
               <w:left w:val="none" w:color="FFFFFF" w:sz="0"/>
@@ -2912,7 +2912,7 @@
         </w:tc>
         <w:tc>
           <w:tcPr>
-            <w:tcW w:type="dxa" w:w="9664"/>
+            <w:tcW w:type="dxa" w:w="9564"/>
             <w:gridSpan w:val="3"/>
             <w:tcBorders>
               <w:top w:val="none" w:color="FFFFFF" w:sz="0"/>
@@ -3140,7 +3140,7 @@
             <w:pPr>
               <w:keepLines/>
               <w:tabs>
-                <w:tab w:val="right" w:pos="9404" w:leader="underscore"/>
+                <w:tab w:val="right" w:pos="9304" w:leader="underscore"/>
               </w:tabs>
               <w:spacing w:after="40" w:before="220"/>
             </w:pPr>
@@ -3169,7 +3169,7 @@
         </w:trPr>
         <w:tc>
           <w:tcPr>
-            <w:tcW w:type="dxa" w:w="560"/>
+            <w:tcW w:type="dxa" w:w="660"/>
             <w:tcBorders>
               <w:top w:val="none" w:color="FFFFFF" w:sz="0"/>
               <w:left w:val="none" w:color="FFFFFF" w:sz="0"/>
@@ -3196,7 +3196,7 @@
         </w:tc>
         <w:tc>
           <w:tcPr>
-            <w:tcW w:type="dxa" w:w="9664"/>
+            <w:tcW w:type="dxa" w:w="9564"/>
             <w:gridSpan w:val="3"/>
             <w:tcBorders>
               <w:top w:val="none" w:color="FFFFFF" w:sz="0"/>
@@ -3244,7 +3244,7 @@
             <w:pPr>
               <w:keepLines/>
               <w:tabs>
-                <w:tab w:val="right" w:pos="9404" w:leader="underscore"/>
+                <w:tab w:val="right" w:pos="9304" w:leader="underscore"/>
               </w:tabs>
               <w:spacing w:after="40" w:before="220"/>
             </w:pPr>
@@ -3269,7 +3269,7 @@
             <w:pPr>
               <w:keepLines/>
               <w:tabs>
-                <w:tab w:val="right" w:pos="9404" w:leader="underscore"/>
+                <w:tab w:val="right" w:pos="9304" w:leader="underscore"/>
               </w:tabs>
               <w:spacing w:after="40" w:before="220"/>
             </w:pPr>
@@ -3298,7 +3298,7 @@
         </w:trPr>
         <w:tc>
           <w:tcPr>
-            <w:tcW w:type="dxa" w:w="560"/>
+            <w:tcW w:type="dxa" w:w="660"/>
             <w:tcBorders>
               <w:top w:val="none" w:color="FFFFFF" w:sz="0"/>
               <w:left w:val="none" w:color="FFFFFF" w:sz="0"/>
@@ -3325,7 +3325,7 @@
         </w:tc>
         <w:tc>
           <w:tcPr>
-            <w:tcW w:type="dxa" w:w="4552"/>
+            <w:tcW w:type="dxa" w:w="4452"/>
             <w:tcBorders>
               <w:top w:val="none" w:color="FFFFFF" w:sz="0"/>
               <w:left w:val="none" w:color="FFFFFF" w:sz="0"/>
@@ -3371,7 +3371,7 @@
             <w:pPr>
               <w:keepLines/>
               <w:tabs>
-                <w:tab w:val="right" w:pos="4132" w:leader="underscore"/>
+                <w:tab w:val="right" w:pos="4032" w:leader="underscore"/>
               </w:tabs>
               <w:spacing w:after="40" w:before="220"/>
             </w:pPr>
@@ -3387,7 +3387,7 @@
         </w:tc>
         <w:tc>
           <w:tcPr>
-            <w:tcW w:type="dxa" w:w="560"/>
+            <w:tcW w:type="dxa" w:w="660"/>
             <w:tcBorders>
               <w:top w:val="none" w:color="FFFFFF" w:sz="0"/>
               <w:left w:val="none" w:color="FFFFFF" w:sz="0"/>
@@ -3414,7 +3414,7 @@
         </w:tc>
         <w:tc>
           <w:tcPr>
-            <w:tcW w:type="dxa" w:w="4552"/>
+            <w:tcW w:type="dxa" w:w="4452"/>
             <w:tcBorders>
               <w:top w:val="none" w:color="FFFFFF" w:sz="0"/>
               <w:left w:val="none" w:color="FFFFFF" w:sz="0"/>
@@ -3460,7 +3460,7 @@
             <w:pPr>
               <w:keepLines/>
               <w:tabs>
-                <w:tab w:val="right" w:pos="4132" w:leader="underscore"/>
+                <w:tab w:val="right" w:pos="4032" w:leader="underscore"/>
               </w:tabs>
               <w:spacing w:after="40" w:before="220"/>
             </w:pPr>
@@ -3481,7 +3481,7 @@
         </w:trPr>
         <w:tc>
           <w:tcPr>
-            <w:tcW w:type="dxa" w:w="560"/>
+            <w:tcW w:type="dxa" w:w="660"/>
             <w:tcBorders>
               <w:top w:val="none" w:color="FFFFFF" w:sz="0"/>
               <w:left w:val="none" w:color="FFFFFF" w:sz="0"/>
@@ -3508,7 +3508,7 @@
         </w:tc>
         <w:tc>
           <w:tcPr>
-            <w:tcW w:type="dxa" w:w="9664"/>
+            <w:tcW w:type="dxa" w:w="9564"/>
             <w:gridSpan w:val="3"/>
             <w:tcBorders>
               <w:top w:val="none" w:color="FFFFFF" w:sz="0"/>
@@ -3585,7 +3585,7 @@
             <w:pPr>
               <w:keepLines/>
               <w:tabs>
-                <w:tab w:val="right" w:pos="9404" w:leader="underscore"/>
+                <w:tab w:val="right" w:pos="9304" w:leader="underscore"/>
               </w:tabs>
               <w:spacing w:after="40" w:before="220"/>
             </w:pPr>
@@ -3610,7 +3610,7 @@
             <w:pPr>
               <w:keepLines/>
               <w:tabs>
-                <w:tab w:val="right" w:pos="9404" w:leader="underscore"/>
+                <w:tab w:val="right" w:pos="9304" w:leader="underscore"/>
               </w:tabs>
               <w:spacing w:after="40" w:before="220"/>
             </w:pPr>
@@ -3639,7 +3639,7 @@
         </w:trPr>
         <w:tc>
           <w:tcPr>
-            <w:tcW w:type="dxa" w:w="560"/>
+            <w:tcW w:type="dxa" w:w="660"/>
             <w:tcBorders>
               <w:top w:val="none" w:color="FFFFFF" w:sz="0"/>
               <w:left w:val="none" w:color="FFFFFF" w:sz="0"/>
@@ -3666,7 +3666,7 @@
         </w:tc>
         <w:tc>
           <w:tcPr>
-            <w:tcW w:type="dxa" w:w="9664"/>
+            <w:tcW w:type="dxa" w:w="9564"/>
             <w:gridSpan w:val="3"/>
             <w:tcBorders>
               <w:top w:val="none" w:color="FFFFFF" w:sz="0"/>
@@ -3732,7 +3732,7 @@
             <w:pPr>
               <w:keepLines/>
               <w:tabs>
-                <w:tab w:val="right" w:pos="9404" w:leader="underscore"/>
+                <w:tab w:val="right" w:pos="9304" w:leader="underscore"/>
               </w:tabs>
               <w:spacing w:after="40" w:before="220"/>
             </w:pPr>
@@ -3749,7 +3749,7 @@
             <w:pPr>
               <w:keepLines/>
               <w:tabs>
-                <w:tab w:val="right" w:pos="9404" w:leader="underscore"/>
+                <w:tab w:val="right" w:pos="9304" w:leader="underscore"/>
               </w:tabs>
               <w:spacing w:after="40" w:before="220"/>
             </w:pPr>
@@ -3766,7 +3766,7 @@
             <w:pPr>
               <w:keepLines/>
               <w:tabs>
-                <w:tab w:val="right" w:pos="9404" w:leader="underscore"/>
+                <w:tab w:val="right" w:pos="9304" w:leader="underscore"/>
               </w:tabs>
               <w:spacing w:after="40" w:before="220"/>
             </w:pPr>
@@ -3787,7 +3787,7 @@
         </w:trPr>
         <w:tc>
           <w:tcPr>
-            <w:tcW w:type="dxa" w:w="560"/>
+            <w:tcW w:type="dxa" w:w="660"/>
             <w:tcBorders>
               <w:top w:val="none" w:color="FFFFFF" w:sz="0"/>
               <w:left w:val="none" w:color="FFFFFF" w:sz="0"/>
@@ -3814,7 +3814,7 @@
         </w:tc>
         <w:tc>
           <w:tcPr>
-            <w:tcW w:type="dxa" w:w="9664"/>
+            <w:tcW w:type="dxa" w:w="9564"/>
             <w:gridSpan w:val="3"/>
             <w:tcBorders>
               <w:top w:val="none" w:color="FFFFFF" w:sz="0"/>
@@ -3880,7 +3880,7 @@
             <w:pPr>
               <w:keepLines/>
               <w:tabs>
-                <w:tab w:val="right" w:pos="9404" w:leader="underscore"/>
+                <w:tab w:val="right" w:pos="9304" w:leader="underscore"/>
               </w:tabs>
               <w:spacing w:after="40" w:before="220"/>
             </w:pPr>
@@ -3905,7 +3905,7 @@
             <w:pPr>
               <w:keepLines/>
               <w:tabs>
-                <w:tab w:val="right" w:pos="9404" w:leader="underscore"/>
+                <w:tab w:val="right" w:pos="9304" w:leader="underscore"/>
               </w:tabs>
               <w:spacing w:after="40" w:before="220"/>
             </w:pPr>
@@ -3930,7 +3930,7 @@
             <w:pPr>
               <w:keepLines/>
               <w:tabs>
-                <w:tab w:val="right" w:pos="9404" w:leader="underscore"/>
+                <w:tab w:val="right" w:pos="9304" w:leader="underscore"/>
               </w:tabs>
               <w:spacing w:after="40" w:before="220"/>
             </w:pPr>
@@ -3955,7 +3955,7 @@
             <w:pPr>
               <w:keepLines/>
               <w:tabs>
-                <w:tab w:val="right" w:pos="9404" w:leader="underscore"/>
+                <w:tab w:val="right" w:pos="9304" w:leader="underscore"/>
               </w:tabs>
               <w:spacing w:after="40" w:before="220"/>
             </w:pPr>

</xml_diff>

<commit_message>
Add study guides for lessons 2-5 to 2-8; apply batch 1 review fixes
Co-Authored-By: Claude Opus 5.5 <noreply@anthropic.com>
</commit_message>
<xml_diff>
--- a/docs/study-guides/chapter-2/word/Lesson-2-01-Represent-4-Digit-Numbers.docx
+++ b/docs/study-guides/chapter-2/word/Lesson-2-01-Represent-4-Digit-Numbers.docx
@@ -3837,7 +3837,7 @@
                 <w:sz w:val="25"/>
                 <w:szCs w:val="25"/>
               </w:rPr>
-              <w:t xml:space="preserve">Use the digits </w:t>
+              <w:t xml:space="preserve">Use all four digits </w:t>
             </w:r>
             <w:r>
               <w:rPr>
@@ -3855,7 +3855,7 @@
                 <w:sz w:val="25"/>
                 <w:szCs w:val="25"/>
               </w:rPr>
-              <w:t xml:space="preserve"> to write the number with the </w:t>
+              <w:t xml:space="preserve"> to write the 4-digit number with the </w:t>
             </w:r>
             <w:r>
               <w:rPr>

</xml_diff>